<commit_message>
Align OneAI copy with a company-owned multi-model platform.
Drop the claim that OneAI is better than ChatGPT, list the eight current capabilities, and regenerate the promo PDF and leadership memo from that same message.

Co-authored-by: Cursor <cursoragent@cursor.com>
</commit_message>
<xml_diff>
--- a/public/documents/oneai-leadership-memo-en.docx
+++ b/public/documents/oneai-leadership-memo-en.docx
@@ -521,7 +521,7 @@
           <w:color w:val="425466"/>
           <w:sz w:val="22"/>
         </w:rPr>
-        <w:t>I recommend we evaluate OneAI from Hyperjump Technology as our company-wide AI platform, or at minimum schedule a 30-minute briefing. This is not about replacing personal ChatGPT for a few people. It is about governing AI now that 20-40 of us already use it.</w:t>
+        <w:t>I recommend we evaluate OneAI from Hyperjump Technology as our company AI platform: one workspace for OpenAI, Claude, Gemini, DeepSeek, and other models, running only for us. Please at least schedule a 30-minute briefing.</w:t>
       </w:r>
     </w:p>
     <w:p>
@@ -656,7 +656,7 @@
           <w:color w:val="425466"/>
           <w:sz w:val="21"/>
         </w:rPr>
-        <w:t>office files, internal knowledge, code execution, and more than one model vendor.</w:t>
+        <w:t>ask files, a VolunteerNow Helpdesk knowledge base, documents, code, web search, PII handling, budgets, and multiple providers in one workspace.</w:t>
       </w:r>
     </w:p>
     <w:p>

</xml_diff>

<commit_message>
Align OneAI copy with a company-owned multi-model platform. (#205)
Drop the claim that OneAI is better than ChatGPT, list the eight current capabilities, and regenerate the promo PDF and leadership memo from that same message.

Co-authored-by: Cursor <cursoragent@cursor.com>
</commit_message>
<xml_diff>
--- a/public/documents/oneai-leadership-memo-en.docx
+++ b/public/documents/oneai-leadership-memo-en.docx
@@ -521,7 +521,7 @@
           <w:color w:val="425466"/>
           <w:sz w:val="22"/>
         </w:rPr>
-        <w:t>I recommend we evaluate OneAI from Hyperjump Technology as our company-wide AI platform, or at minimum schedule a 30-minute briefing. This is not about replacing personal ChatGPT for a few people. It is about governing AI now that 20-40 of us already use it.</w:t>
+        <w:t>I recommend we evaluate OneAI from Hyperjump Technology as our company AI platform: one workspace for OpenAI, Claude, Gemini, DeepSeek, and other models, running only for us. Please at least schedule a 30-minute briefing.</w:t>
       </w:r>
     </w:p>
     <w:p>
@@ -656,7 +656,7 @@
           <w:color w:val="425466"/>
           <w:sz w:val="21"/>
         </w:rPr>
-        <w:t>office files, internal knowledge, code execution, and more than one model vendor.</w:t>
+        <w:t>ask files, a VolunteerNow Helpdesk knowledge base, documents, code, web search, PII handling, budgets, and multiple providers in one workspace.</w:t>
       </w:r>
     </w:p>
     <w:p>

</xml_diff>